<commit_message>
updated qa reports for verify 0.17.0
Signed-off-by: ckesiraju <chaitanya.k@cyberpwn.com>
</commit_message>
<xml_diff>
--- a/inji verify/0.17.0/Inji_Verify_0.17.0_Functional_Test_Report.docx
+++ b/inji verify/0.17.0/Inji_Verify_0.17.0_Functional_Test_Report.docx
@@ -1854,7 +1854,7 @@
     </w:p>
     <w:sdt>
       <w:sdtPr>
-        <w:id w:val="-1603228752"/>
+        <w:id w:val="-740899191"/>
         <w:docPartObj>
           <w:docPartGallery w:val="Table of Contents"/>
           <w:docPartUnique w:val="1"/>
@@ -7607,21 +7607,30 @@
             <w:r>
               <w:rPr>
                 <w:rFonts w:ascii="Calibri" w:cs="Calibri" w:eastAsia="Calibri" w:hAnsi="Calibri"/>
-                <w:b w:val="0"/>
-                <w:bCs w:val="0"/>
-                <w:i w:val="0"/>
-                <w:iCs w:val="0"/>
-                <w:smallCaps w:val="0"/>
-                <w:strike w:val="0"/>
-                <w:color w:val="000000"/>
-                <w:sz w:val="24"/>
-                <w:szCs w:val="24"/>
-                <w:u w:val="none"/>
-                <w:shd w:fill="auto" w:val="clear"/>
-                <w:vertAlign w:val="baseline"/>
-                <w:rtl w:val="0"/>
-              </w:rPr>
-              <w:t xml:space="preserve">mosipqa/inji-verify-service:0.1</w:t>
+                <w:sz w:val="24"/>
+                <w:szCs w:val="24"/>
+                <w:rtl w:val="0"/>
+              </w:rPr>
+              <w:t xml:space="preserve">injistackqa</w:t>
+            </w:r>
+            <w:r>
+              <w:rPr>
+                <w:rFonts w:ascii="Calibri" w:cs="Calibri" w:eastAsia="Calibri" w:hAnsi="Calibri"/>
+                <w:b w:val="0"/>
+                <w:bCs w:val="0"/>
+                <w:i w:val="0"/>
+                <w:iCs w:val="0"/>
+                <w:smallCaps w:val="0"/>
+                <w:strike w:val="0"/>
+                <w:color w:val="000000"/>
+                <w:sz w:val="24"/>
+                <w:szCs w:val="24"/>
+                <w:u w:val="none"/>
+                <w:shd w:fill="auto" w:val="clear"/>
+                <w:vertAlign w:val="baseline"/>
+                <w:rtl w:val="0"/>
+              </w:rPr>
+              <w:t xml:space="preserve">/inji-verify-service:0.1</w:t>
             </w:r>
             <w:r>
               <w:rPr>
@@ -7697,21 +7706,30 @@
             <w:r>
               <w:rPr>
                 <w:rFonts w:ascii="Calibri" w:cs="Calibri" w:eastAsia="Calibri" w:hAnsi="Calibri"/>
-                <w:b w:val="0"/>
-                <w:bCs w:val="0"/>
-                <w:i w:val="0"/>
-                <w:iCs w:val="0"/>
-                <w:smallCaps w:val="0"/>
-                <w:strike w:val="0"/>
-                <w:color w:val="000000"/>
-                <w:sz w:val="24"/>
-                <w:szCs w:val="24"/>
-                <w:u w:val="none"/>
-                <w:shd w:fill="auto" w:val="clear"/>
-                <w:vertAlign w:val="baseline"/>
-                <w:rtl w:val="0"/>
-              </w:rPr>
-              <w:t xml:space="preserve">mosipqa/inji-verify-ui:0.1</w:t>
+                <w:sz w:val="24"/>
+                <w:szCs w:val="24"/>
+                <w:rtl w:val="0"/>
+              </w:rPr>
+              <w:t xml:space="preserve">injistackqa</w:t>
+            </w:r>
+            <w:r>
+              <w:rPr>
+                <w:rFonts w:ascii="Calibri" w:cs="Calibri" w:eastAsia="Calibri" w:hAnsi="Calibri"/>
+                <w:b w:val="0"/>
+                <w:bCs w:val="0"/>
+                <w:i w:val="0"/>
+                <w:iCs w:val="0"/>
+                <w:smallCaps w:val="0"/>
+                <w:strike w:val="0"/>
+                <w:color w:val="000000"/>
+                <w:sz w:val="24"/>
+                <w:szCs w:val="24"/>
+                <w:u w:val="none"/>
+                <w:shd w:fill="auto" w:val="clear"/>
+                <w:vertAlign w:val="baseline"/>
+                <w:rtl w:val="0"/>
+              </w:rPr>
+              <w:t xml:space="preserve">/inji-verify-ui:0.1</w:t>
             </w:r>
             <w:r>
               <w:rPr>
@@ -7787,21 +7805,30 @@
             <w:r>
               <w:rPr>
                 <w:rFonts w:ascii="Calibri" w:cs="Calibri" w:eastAsia="Calibri" w:hAnsi="Calibri"/>
-                <w:b w:val="0"/>
-                <w:bCs w:val="0"/>
-                <w:i w:val="0"/>
-                <w:iCs w:val="0"/>
-                <w:smallCaps w:val="0"/>
-                <w:strike w:val="0"/>
-                <w:color w:val="000000"/>
-                <w:sz w:val="24"/>
-                <w:szCs w:val="24"/>
-                <w:u w:val="none"/>
-                <w:shd w:fill="auto" w:val="clear"/>
-                <w:vertAlign w:val="baseline"/>
-                <w:rtl w:val="0"/>
-              </w:rPr>
-              <w:t xml:space="preserve">mosipqa/inji-certify-with-plugins:0.13.x</w:t>
+                <w:sz w:val="24"/>
+                <w:szCs w:val="24"/>
+                <w:rtl w:val="0"/>
+              </w:rPr>
+              <w:t xml:space="preserve">injistackqa</w:t>
+            </w:r>
+            <w:r>
+              <w:rPr>
+                <w:rFonts w:ascii="Calibri" w:cs="Calibri" w:eastAsia="Calibri" w:hAnsi="Calibri"/>
+                <w:b w:val="0"/>
+                <w:bCs w:val="0"/>
+                <w:i w:val="0"/>
+                <w:iCs w:val="0"/>
+                <w:smallCaps w:val="0"/>
+                <w:strike w:val="0"/>
+                <w:color w:val="000000"/>
+                <w:sz w:val="24"/>
+                <w:szCs w:val="24"/>
+                <w:u w:val="none"/>
+                <w:shd w:fill="auto" w:val="clear"/>
+                <w:vertAlign w:val="baseline"/>
+                <w:rtl w:val="0"/>
+              </w:rPr>
+              <w:t xml:space="preserve">/inji-certify-with-plugins:0.13.x</w:t>
             </w:r>
           </w:p>
         </w:tc>
@@ -7849,21 +7876,30 @@
             <w:r>
               <w:rPr>
                 <w:rFonts w:ascii="Calibri" w:cs="Calibri" w:eastAsia="Calibri" w:hAnsi="Calibri"/>
-                <w:b w:val="0"/>
-                <w:bCs w:val="0"/>
-                <w:i w:val="0"/>
-                <w:iCs w:val="0"/>
-                <w:smallCaps w:val="0"/>
-                <w:strike w:val="0"/>
-                <w:color w:val="000000"/>
-                <w:sz w:val="24"/>
-                <w:szCs w:val="24"/>
-                <w:u w:val="none"/>
-                <w:shd w:fill="auto" w:val="clear"/>
-                <w:vertAlign w:val="baseline"/>
-                <w:rtl w:val="0"/>
-              </w:rPr>
-              <w:t xml:space="preserve">mosipqa/inji-web:develop</w:t>
+                <w:sz w:val="24"/>
+                <w:szCs w:val="24"/>
+                <w:rtl w:val="0"/>
+              </w:rPr>
+              <w:t xml:space="preserve">injistackqa</w:t>
+            </w:r>
+            <w:r>
+              <w:rPr>
+                <w:rFonts w:ascii="Calibri" w:cs="Calibri" w:eastAsia="Calibri" w:hAnsi="Calibri"/>
+                <w:b w:val="0"/>
+                <w:bCs w:val="0"/>
+                <w:i w:val="0"/>
+                <w:iCs w:val="0"/>
+                <w:smallCaps w:val="0"/>
+                <w:strike w:val="0"/>
+                <w:color w:val="000000"/>
+                <w:sz w:val="24"/>
+                <w:szCs w:val="24"/>
+                <w:u w:val="none"/>
+                <w:shd w:fill="auto" w:val="clear"/>
+                <w:vertAlign w:val="baseline"/>
+                <w:rtl w:val="0"/>
+              </w:rPr>
+              <w:t xml:space="preserve">/inji-web:develop</w:t>
             </w:r>
           </w:p>
         </w:tc>
@@ -8018,21 +8054,30 @@
             <w:r>
               <w:rPr>
                 <w:rFonts w:ascii="Calibri" w:cs="Calibri" w:eastAsia="Calibri" w:hAnsi="Calibri"/>
-                <w:b w:val="0"/>
-                <w:bCs w:val="0"/>
-                <w:i w:val="0"/>
-                <w:iCs w:val="0"/>
-                <w:smallCaps w:val="0"/>
-                <w:strike w:val="0"/>
-                <w:color w:val="000000"/>
-                <w:sz w:val="24"/>
-                <w:szCs w:val="24"/>
-                <w:u w:val="none"/>
-                <w:shd w:fill="auto" w:val="clear"/>
-                <w:vertAlign w:val="baseline"/>
-                <w:rtl w:val="0"/>
-              </w:rPr>
-              <w:t xml:space="preserve">mosipid/mimoto:0.20.0</w:t>
+                <w:sz w:val="24"/>
+                <w:szCs w:val="24"/>
+                <w:rtl w:val="0"/>
+              </w:rPr>
+              <w:t xml:space="preserve">injistackqa</w:t>
+            </w:r>
+            <w:r>
+              <w:rPr>
+                <w:rFonts w:ascii="Calibri" w:cs="Calibri" w:eastAsia="Calibri" w:hAnsi="Calibri"/>
+                <w:b w:val="0"/>
+                <w:bCs w:val="0"/>
+                <w:i w:val="0"/>
+                <w:iCs w:val="0"/>
+                <w:smallCaps w:val="0"/>
+                <w:strike w:val="0"/>
+                <w:color w:val="000000"/>
+                <w:sz w:val="24"/>
+                <w:szCs w:val="24"/>
+                <w:u w:val="none"/>
+                <w:shd w:fill="auto" w:val="clear"/>
+                <w:vertAlign w:val="baseline"/>
+                <w:rtl w:val="0"/>
+              </w:rPr>
+              <w:t xml:space="preserve">/mimoto:0.20.0</w:t>
             </w:r>
           </w:p>
         </w:tc>
@@ -8080,21 +8125,30 @@
             <w:r>
               <w:rPr>
                 <w:rFonts w:ascii="Calibri" w:cs="Calibri" w:eastAsia="Calibri" w:hAnsi="Calibri"/>
-                <w:b w:val="0"/>
-                <w:bCs w:val="0"/>
-                <w:i w:val="0"/>
-                <w:iCs w:val="0"/>
-                <w:smallCaps w:val="0"/>
-                <w:strike w:val="0"/>
-                <w:color w:val="000000"/>
-                <w:sz w:val="24"/>
-                <w:szCs w:val="24"/>
-                <w:u w:val="none"/>
-                <w:shd w:fill="auto" w:val="clear"/>
-                <w:vertAlign w:val="baseline"/>
-                <w:rtl w:val="0"/>
-              </w:rPr>
-              <w:t xml:space="preserve">mosipid/inji-verify-service:0.15.2</w:t>
+                <w:sz w:val="24"/>
+                <w:szCs w:val="24"/>
+                <w:rtl w:val="0"/>
+              </w:rPr>
+              <w:t xml:space="preserve">injistackqa</w:t>
+            </w:r>
+            <w:r>
+              <w:rPr>
+                <w:rFonts w:ascii="Calibri" w:cs="Calibri" w:eastAsia="Calibri" w:hAnsi="Calibri"/>
+                <w:b w:val="0"/>
+                <w:bCs w:val="0"/>
+                <w:i w:val="0"/>
+                <w:iCs w:val="0"/>
+                <w:smallCaps w:val="0"/>
+                <w:strike w:val="0"/>
+                <w:color w:val="000000"/>
+                <w:sz w:val="24"/>
+                <w:szCs w:val="24"/>
+                <w:u w:val="none"/>
+                <w:shd w:fill="auto" w:val="clear"/>
+                <w:vertAlign w:val="baseline"/>
+                <w:rtl w:val="0"/>
+              </w:rPr>
+              <w:t xml:space="preserve">/inji-verify-service:0.15.2</w:t>
             </w:r>
           </w:p>
         </w:tc>
@@ -8142,21 +8196,30 @@
             <w:r>
               <w:rPr>
                 <w:rFonts w:ascii="Calibri" w:cs="Calibri" w:eastAsia="Calibri" w:hAnsi="Calibri"/>
-                <w:b w:val="0"/>
-                <w:bCs w:val="0"/>
-                <w:i w:val="0"/>
-                <w:iCs w:val="0"/>
-                <w:smallCaps w:val="0"/>
-                <w:strike w:val="0"/>
-                <w:color w:val="000000"/>
-                <w:sz w:val="24"/>
-                <w:szCs w:val="24"/>
-                <w:u w:val="none"/>
-                <w:shd w:fill="auto" w:val="clear"/>
-                <w:vertAlign w:val="baseline"/>
-                <w:rtl w:val="0"/>
-              </w:rPr>
-              <w:t xml:space="preserve">mosipid/inji-verify-ui:0.15.2</w:t>
+                <w:sz w:val="24"/>
+                <w:szCs w:val="24"/>
+                <w:rtl w:val="0"/>
+              </w:rPr>
+              <w:t xml:space="preserve">injistackqa</w:t>
+            </w:r>
+            <w:r>
+              <w:rPr>
+                <w:rFonts w:ascii="Calibri" w:cs="Calibri" w:eastAsia="Calibri" w:hAnsi="Calibri"/>
+                <w:b w:val="0"/>
+                <w:bCs w:val="0"/>
+                <w:i w:val="0"/>
+                <w:iCs w:val="0"/>
+                <w:smallCaps w:val="0"/>
+                <w:strike w:val="0"/>
+                <w:color w:val="000000"/>
+                <w:sz w:val="24"/>
+                <w:szCs w:val="24"/>
+                <w:u w:val="none"/>
+                <w:shd w:fill="auto" w:val="clear"/>
+                <w:vertAlign w:val="baseline"/>
+                <w:rtl w:val="0"/>
+              </w:rPr>
+              <w:t xml:space="preserve">/inji-verify-ui:0.15.2</w:t>
             </w:r>
           </w:p>
         </w:tc>
@@ -8204,21 +8267,30 @@
             <w:r>
               <w:rPr>
                 <w:rFonts w:ascii="Calibri" w:cs="Calibri" w:eastAsia="Calibri" w:hAnsi="Calibri"/>
-                <w:b w:val="0"/>
-                <w:bCs w:val="0"/>
-                <w:i w:val="0"/>
-                <w:iCs w:val="0"/>
-                <w:smallCaps w:val="0"/>
-                <w:strike w:val="0"/>
-                <w:color w:val="000000"/>
-                <w:sz w:val="24"/>
-                <w:szCs w:val="24"/>
-                <w:u w:val="none"/>
-                <w:shd w:fill="auto" w:val="clear"/>
-                <w:vertAlign w:val="baseline"/>
-                <w:rtl w:val="0"/>
-              </w:rPr>
-              <w:t xml:space="preserve">mosipid/inji-certify-with-plugins:0.13.1</w:t>
+                <w:sz w:val="24"/>
+                <w:szCs w:val="24"/>
+                <w:rtl w:val="0"/>
+              </w:rPr>
+              <w:t xml:space="preserve">injistackqa</w:t>
+            </w:r>
+            <w:r>
+              <w:rPr>
+                <w:rFonts w:ascii="Calibri" w:cs="Calibri" w:eastAsia="Calibri" w:hAnsi="Calibri"/>
+                <w:b w:val="0"/>
+                <w:bCs w:val="0"/>
+                <w:i w:val="0"/>
+                <w:iCs w:val="0"/>
+                <w:smallCaps w:val="0"/>
+                <w:strike w:val="0"/>
+                <w:color w:val="000000"/>
+                <w:sz w:val="24"/>
+                <w:szCs w:val="24"/>
+                <w:u w:val="none"/>
+                <w:shd w:fill="auto" w:val="clear"/>
+                <w:vertAlign w:val="baseline"/>
+                <w:rtl w:val="0"/>
+              </w:rPr>
+              <w:t xml:space="preserve">/inji-certify-with-plugins:0.13.1</w:t>
             </w:r>
           </w:p>
         </w:tc>
@@ -8266,21 +8338,30 @@
             <w:r>
               <w:rPr>
                 <w:rFonts w:ascii="Calibri" w:cs="Calibri" w:eastAsia="Calibri" w:hAnsi="Calibri"/>
-                <w:b w:val="0"/>
-                <w:bCs w:val="0"/>
-                <w:i w:val="0"/>
-                <w:iCs w:val="0"/>
-                <w:smallCaps w:val="0"/>
-                <w:strike w:val="0"/>
-                <w:color w:val="000000"/>
-                <w:sz w:val="24"/>
-                <w:szCs w:val="24"/>
-                <w:u w:val="none"/>
-                <w:shd w:fill="auto" w:val="clear"/>
-                <w:vertAlign w:val="baseline"/>
-                <w:rtl w:val="0"/>
-              </w:rPr>
-              <w:t xml:space="preserve">mosipid/authentication-service:1.2.1.0</w:t>
+                <w:sz w:val="24"/>
+                <w:szCs w:val="24"/>
+                <w:rtl w:val="0"/>
+              </w:rPr>
+              <w:t xml:space="preserve">injistackqa</w:t>
+            </w:r>
+            <w:r>
+              <w:rPr>
+                <w:rFonts w:ascii="Calibri" w:cs="Calibri" w:eastAsia="Calibri" w:hAnsi="Calibri"/>
+                <w:b w:val="0"/>
+                <w:bCs w:val="0"/>
+                <w:i w:val="0"/>
+                <w:iCs w:val="0"/>
+                <w:smallCaps w:val="0"/>
+                <w:strike w:val="0"/>
+                <w:color w:val="000000"/>
+                <w:sz w:val="24"/>
+                <w:szCs w:val="24"/>
+                <w:u w:val="none"/>
+                <w:shd w:fill="auto" w:val="clear"/>
+                <w:vertAlign w:val="baseline"/>
+                <w:rtl w:val="0"/>
+              </w:rPr>
+              <w:t xml:space="preserve">/authentication-service:1.2.1.0</w:t>
             </w:r>
           </w:p>
         </w:tc>
@@ -8328,21 +8409,30 @@
             <w:r>
               <w:rPr>
                 <w:rFonts w:ascii="Calibri" w:cs="Calibri" w:eastAsia="Calibri" w:hAnsi="Calibri"/>
-                <w:b w:val="0"/>
-                <w:bCs w:val="0"/>
-                <w:i w:val="0"/>
-                <w:iCs w:val="0"/>
-                <w:smallCaps w:val="0"/>
-                <w:strike w:val="0"/>
-                <w:color w:val="000000"/>
-                <w:sz w:val="24"/>
-                <w:szCs w:val="24"/>
-                <w:u w:val="none"/>
-                <w:shd w:fill="auto" w:val="clear"/>
-                <w:vertAlign w:val="baseline"/>
-                <w:rtl w:val="0"/>
-              </w:rPr>
-              <w:t xml:space="preserve">mosipid/authentication-internal-service:1.2.1.0</w:t>
+                <w:sz w:val="24"/>
+                <w:szCs w:val="24"/>
+                <w:rtl w:val="0"/>
+              </w:rPr>
+              <w:t xml:space="preserve">injistackqa</w:t>
+            </w:r>
+            <w:r>
+              <w:rPr>
+                <w:rFonts w:ascii="Calibri" w:cs="Calibri" w:eastAsia="Calibri" w:hAnsi="Calibri"/>
+                <w:b w:val="0"/>
+                <w:bCs w:val="0"/>
+                <w:i w:val="0"/>
+                <w:iCs w:val="0"/>
+                <w:smallCaps w:val="0"/>
+                <w:strike w:val="0"/>
+                <w:color w:val="000000"/>
+                <w:sz w:val="24"/>
+                <w:szCs w:val="24"/>
+                <w:u w:val="none"/>
+                <w:shd w:fill="auto" w:val="clear"/>
+                <w:vertAlign w:val="baseline"/>
+                <w:rtl w:val="0"/>
+              </w:rPr>
+              <w:t xml:space="preserve">/authentication-internal-service:1.2.1.0</w:t>
             </w:r>
           </w:p>
         </w:tc>
@@ -8390,21 +8480,30 @@
             <w:r>
               <w:rPr>
                 <w:rFonts w:ascii="Calibri" w:cs="Calibri" w:eastAsia="Calibri" w:hAnsi="Calibri"/>
-                <w:b w:val="0"/>
-                <w:bCs w:val="0"/>
-                <w:i w:val="0"/>
-                <w:iCs w:val="0"/>
-                <w:smallCaps w:val="0"/>
-                <w:strike w:val="0"/>
-                <w:color w:val="000000"/>
-                <w:sz w:val="24"/>
-                <w:szCs w:val="24"/>
-                <w:u w:val="none"/>
-                <w:shd w:fill="auto" w:val="clear"/>
-                <w:vertAlign w:val="baseline"/>
-                <w:rtl w:val="0"/>
-              </w:rPr>
-              <w:t xml:space="preserve">mosipid/authentication-otp-service:1.2.1.0</w:t>
+                <w:sz w:val="24"/>
+                <w:szCs w:val="24"/>
+                <w:rtl w:val="0"/>
+              </w:rPr>
+              <w:t xml:space="preserve">injistackqa</w:t>
+            </w:r>
+            <w:r>
+              <w:rPr>
+                <w:rFonts w:ascii="Calibri" w:cs="Calibri" w:eastAsia="Calibri" w:hAnsi="Calibri"/>
+                <w:b w:val="0"/>
+                <w:bCs w:val="0"/>
+                <w:i w:val="0"/>
+                <w:iCs w:val="0"/>
+                <w:smallCaps w:val="0"/>
+                <w:strike w:val="0"/>
+                <w:color w:val="000000"/>
+                <w:sz w:val="24"/>
+                <w:szCs w:val="24"/>
+                <w:u w:val="none"/>
+                <w:shd w:fill="auto" w:val="clear"/>
+                <w:vertAlign w:val="baseline"/>
+                <w:rtl w:val="0"/>
+              </w:rPr>
+              <w:t xml:space="preserve">/authentication-otp-service:1.2.1.0</w:t>
             </w:r>
           </w:p>
         </w:tc>

</xml_diff>